<commit_message>
Fix orphaned table captions in FINAL_THESIS.docx
The section break for each landscape table was inserted between the caption
paragraph and its table, stranding all four 'Table N.' captions on the
preceding portrait page. The builder now holds a detected caption and emits
it inside the landscape section directly above its table. Verified: all four
captions are immediately followed by their tables in body order.

Co-Authored-By: Claude Fable 5 <noreply@anthropic.com>
Claude-Session: https://claude.ai/code/session_01HJq9GBe6o3FZumGTYdfLDW
</commit_message>
<xml_diff>
--- a/thesis/FINAL_THESIS.docx
+++ b/thesis/FINAL_THESIS.docx
@@ -595,23 +595,6 @@
     <w:p>
       <w:r>
         <w:t>Of the four categories, the regulatory/institutional category is supported by the least direct empirical evidence: as Table 1 shows, only two of its themes have any direct empirical source, and one theme rests on review evidence alone. Most of the category's content is accordingly review-level or conceptual.</w:t>
-      </w:r>
-    </w:p>
-    <w:p>
-      <w:r>
-        <w:rPr>
-          <w:b/>
-        </w:rPr>
-        <w:t>Table 1.</w:t>
-      </w:r>
-      <w:r>
-        <w:t xml:space="preserve"> </w:t>
-      </w:r>
-      <w:r>
-        <w:rPr>
-          <w:i/>
-        </w:rPr>
-        <w:t>Regulatory/institutional barrier themes, evidence types, and Asia-specificity status.</w:t>
       </w:r>
     </w:p>
     <w:p>
@@ -623,6 +606,23 @@
           <w:docGrid w:linePitch="360"/>
         </w:sectPr>
       </w:pPr>
+    </w:p>
+    <w:p>
+      <w:r>
+        <w:rPr>
+          <w:b/>
+        </w:rPr>
+        <w:t>Table 1.</w:t>
+      </w:r>
+      <w:r>
+        <w:t xml:space="preserve"> </w:t>
+      </w:r>
+      <w:r>
+        <w:rPr>
+          <w:i/>
+        </w:rPr>
+        <w:t>Regulatory/institutional barrier themes, evidence types, and Asia-specificity status.</w:t>
+      </w:r>
     </w:p>
     <w:tbl>
       <w:tblPr>
@@ -1005,23 +1005,6 @@
       </w:r>
     </w:p>
     <w:p>
-      <w:r>
-        <w:rPr>
-          <w:b/>
-        </w:rPr>
-        <w:t>Table 2.</w:t>
-      </w:r>
-      <w:r>
-        <w:t xml:space="preserve"> </w:t>
-      </w:r>
-      <w:r>
-        <w:rPr>
-          <w:i/>
-        </w:rPr>
-        <w:t>Cultural/organisational barrier themes, evidence types, and Asia-specificity status.</w:t>
-      </w:r>
-    </w:p>
-    <w:p>
       <w:pPr>
         <w:sectPr>
           <w:pgSz w:w="12240" w:h="15840"/>
@@ -1030,6 +1013,23 @@
           <w:docGrid w:linePitch="360"/>
         </w:sectPr>
       </w:pPr>
+    </w:p>
+    <w:p>
+      <w:r>
+        <w:rPr>
+          <w:b/>
+        </w:rPr>
+        <w:t>Table 2.</w:t>
+      </w:r>
+      <w:r>
+        <w:t xml:space="preserve"> </w:t>
+      </w:r>
+      <w:r>
+        <w:rPr>
+          <w:i/>
+        </w:rPr>
+        <w:t>Cultural/organisational barrier themes, evidence types, and Asia-specificity status.</w:t>
+      </w:r>
     </w:p>
     <w:tbl>
       <w:tblPr>
@@ -1586,23 +1586,6 @@
       </w:r>
     </w:p>
     <w:p>
-      <w:r>
-        <w:rPr>
-          <w:b/>
-        </w:rPr>
-        <w:t>Table 3.</w:t>
-      </w:r>
-      <w:r>
-        <w:t xml:space="preserve"> </w:t>
-      </w:r>
-      <w:r>
-        <w:rPr>
-          <w:i/>
-        </w:rPr>
-        <w:t>Cost/operational barrier themes, evidence types, and Asia-specificity status.</w:t>
-      </w:r>
-    </w:p>
-    <w:p>
       <w:pPr>
         <w:sectPr>
           <w:pgSz w:w="12240" w:h="15840"/>
@@ -1611,6 +1594,23 @@
           <w:docGrid w:linePitch="360"/>
         </w:sectPr>
       </w:pPr>
+    </w:p>
+    <w:p>
+      <w:r>
+        <w:rPr>
+          <w:b/>
+        </w:rPr>
+        <w:t>Table 3.</w:t>
+      </w:r>
+      <w:r>
+        <w:t xml:space="preserve"> </w:t>
+      </w:r>
+      <w:r>
+        <w:rPr>
+          <w:i/>
+        </w:rPr>
+        <w:t>Cost/operational barrier themes, evidence types, and Asia-specificity status.</w:t>
+      </w:r>
     </w:p>
     <w:tbl>
       <w:tblPr>
@@ -2167,23 +2167,6 @@
       </w:r>
     </w:p>
     <w:p>
-      <w:r>
-        <w:rPr>
-          <w:b/>
-        </w:rPr>
-        <w:t>Table 4.</w:t>
-      </w:r>
-      <w:r>
-        <w:t xml:space="preserve"> </w:t>
-      </w:r>
-      <w:r>
-        <w:rPr>
-          <w:i/>
-        </w:rPr>
-        <w:t>Asset/capability barrier themes, evidence types, and Asia-specificity status.</w:t>
-      </w:r>
-    </w:p>
-    <w:p>
       <w:pPr>
         <w:sectPr>
           <w:pgSz w:w="12240" w:h="15840"/>
@@ -2192,6 +2175,23 @@
           <w:docGrid w:linePitch="360"/>
         </w:sectPr>
       </w:pPr>
+    </w:p>
+    <w:p>
+      <w:r>
+        <w:rPr>
+          <w:b/>
+        </w:rPr>
+        <w:t>Table 4.</w:t>
+      </w:r>
+      <w:r>
+        <w:t xml:space="preserve"> </w:t>
+      </w:r>
+      <w:r>
+        <w:rPr>
+          <w:i/>
+        </w:rPr>
+        <w:t>Asset/capability barrier themes, evidence types, and Asia-specificity status.</w:t>
+      </w:r>
     </w:p>
     <w:tbl>
       <w:tblPr>

</xml_diff>